<commit_message>
Develop of exercise3 and exercise3_tets, adding also the information on word docuemtn
</commit_message>
<xml_diff>
--- a/Actividad 7 TALLER/Actividad 7. Taller - Vectores y matrices (2).docx
+++ b/Actividad 7 TALLER/Actividad 7. Taller - Vectores y matrices (2).docx
@@ -301,9 +301,12 @@
       </w:r>
       <w:proofErr w:type="spellStart"/>
       <w:r>
-        <w:t>bc.</w:t>
+        <w:t>bc</w:t>
       </w:r>
       <w:proofErr w:type="spellEnd"/>
+      <w:r>
+        <w:t>.</w:t>
+      </w:r>
     </w:p>
     <w:p>
       <w:pPr>
@@ -353,6 +356,27 @@
     <w:p>
       <w:pPr>
         <w:pStyle w:val="Prrafodelista"/>
+        <w:ind w:left="360"/>
+        <w:jc w:val="both"/>
+      </w:pPr>
+    </w:p>
+    <w:p>
+      <w:pPr>
+        <w:pStyle w:val="Prrafodelista"/>
+        <w:ind w:left="360"/>
+        <w:jc w:val="both"/>
+      </w:pPr>
+    </w:p>
+    <w:p>
+      <w:pPr>
+        <w:pStyle w:val="Prrafodelista"/>
+        <w:ind w:left="360"/>
+        <w:jc w:val="both"/>
+      </w:pPr>
+    </w:p>
+    <w:p>
+      <w:pPr>
+        <w:pStyle w:val="Prrafodelista"/>
         <w:numPr>
           <w:ilvl w:val="0"/>
           <w:numId w:val="1"/>
@@ -360,11 +384,8 @@
         <w:jc w:val="both"/>
       </w:pPr>
       <w:r>
-        <w:t xml:space="preserve">En una universidad se efectúa un examen de admisión que consta de dos pruebas: aptitud matemática y aptitud verbal. Cada pregunta tiene 5 opciones numeradas del 1 al 5. Se prepara un registro con 60 campos de una sola posición que contiene, cada </w:t>
-      </w:r>
-      <w:r>
         <w:lastRenderedPageBreak/>
-        <w:t>uno, la respuesta correcta a la pregunta correspondiente. Las 30 primeras posiciones corresponden al examen de aptitud matemática y las restantes a las de aptitud verbal. Se presentaron al examen N estudiantes y para cada uno de ellos se preparó un registro con los siguientes datos:</w:t>
+        <w:t>En una universidad se efectúa un examen de admisión que consta de dos pruebas: aptitud matemática y aptitud verbal. Cada pregunta tiene 5 opciones numeradas del 1 al 5. Se prepara un registro con 60 campos de una sola posición que contiene, cada uno, la respuesta correcta a la pregunta correspondiente. Las 30 primeras posiciones corresponden al examen de aptitud matemática y las restantes a las de aptitud verbal. Se presentaron al examen N estudiantes y para cada uno de ellos se preparó un registro con los siguientes datos:</w:t>
       </w:r>
     </w:p>
     <w:p>
@@ -499,11 +520,125 @@
           <w:ilvl w:val="1"/>
           <w:numId w:val="1"/>
         </w:numPr>
+        <w:pBdr>
+          <w:bottom w:val="single" w:sz="6" w:space="1" w:color="auto"/>
+        </w:pBdr>
         <w:jc w:val="both"/>
       </w:pPr>
       <w:r>
         <w:t>El mayor puntaje y el número de la credencial del estudiante que la obtuvo.</w:t>
       </w:r>
+    </w:p>
+    <w:p>
+      <w:pPr>
+        <w:jc w:val="both"/>
+      </w:pPr>
+    </w:p>
+    <w:p>
+      <w:pPr>
+        <w:jc w:val="both"/>
+      </w:pPr>
+    </w:p>
+    <w:p>
+      <w:pPr>
+        <w:pStyle w:val="Prrafodelista"/>
+        <w:numPr>
+          <w:ilvl w:val="0"/>
+          <w:numId w:val="10"/>
+        </w:numPr>
+        <w:rPr>
+          <w:rFonts w:ascii="Times New Roman" w:eastAsia="Times New Roman" w:hAnsi="Times New Roman" w:cs="Times New Roman"/>
+          <w:lang w:val="es-CO" w:eastAsia="es-CO"/>
+        </w:rPr>
+      </w:pPr>
+      <w:r>
+        <w:rPr>
+          <w:rFonts w:ascii="Times New Roman" w:eastAsia="Times New Roman" w:hAnsi="Times New Roman" w:cs="Times New Roman"/>
+          <w:lang w:val="es-CO" w:eastAsia="es-CO"/>
+        </w:rPr>
+        <w:t xml:space="preserve">El problema requiere evaluar el desempeño de </w:t>
+      </w:r>
+      <w:r>
+        <w:rPr>
+          <w:rFonts w:ascii="Arial" w:eastAsia="Times New Roman" w:hAnsi="Arial" w:cs="Arial"/>
+          <w:lang w:val="es-CO" w:eastAsia="es-CO"/>
+        </w:rPr>
+        <w:t>N</w:t>
+      </w:r>
+      <w:r>
+        <w:rPr>
+          <w:rFonts w:ascii="Times New Roman" w:eastAsia="Times New Roman" w:hAnsi="Times New Roman" w:cs="Times New Roman"/>
+          <w:lang w:val="es-CO" w:eastAsia="es-CO"/>
+        </w:rPr>
+        <w:t xml:space="preserve"> estudiantes en un examen de admisión de 60 preguntas, dividido equitativamente entre Aptitud Matemática (primeras 30) y Aptitud Verbal (restantes 30).</w:t>
+      </w:r>
+    </w:p>
+    <w:p>
+      <w:pPr>
+        <w:pStyle w:val="Prrafodelista"/>
+        <w:numPr>
+          <w:ilvl w:val="0"/>
+          <w:numId w:val="10"/>
+        </w:numPr>
+        <w:jc w:val="both"/>
+      </w:pPr>
+      <w:r>
+        <w:t>Se diseñó una función contenedora principal que recibe la plantilla de respuestas correctas y la lista de estudiantes.</w:t>
+      </w:r>
+    </w:p>
+    <w:p>
+      <w:pPr>
+        <w:pStyle w:val="Prrafodelista"/>
+        <w:numPr>
+          <w:ilvl w:val="0"/>
+          <w:numId w:val="10"/>
+        </w:numPr>
+        <w:jc w:val="both"/>
+      </w:pPr>
+      <w:r>
+        <w:t xml:space="preserve">Internamente, se segmenta la plantilla usando </w:t>
+      </w:r>
+      <w:r>
+        <w:rPr>
+          <w:i/>
+          <w:iCs/>
+        </w:rPr>
+        <w:t>slicing</w:t>
+      </w:r>
+      <w:r>
+        <w:t xml:space="preserve"> de listas (plantilla[:30] y plantilla[30:]).</w:t>
+      </w:r>
+    </w:p>
+    <w:p>
+      <w:pPr>
+        <w:pStyle w:val="Prrafodelista"/>
+        <w:numPr>
+          <w:ilvl w:val="0"/>
+          <w:numId w:val="10"/>
+        </w:numPr>
+        <w:jc w:val="both"/>
+      </w:pPr>
+      <w:r>
+        <w:t>La comparación de las respuestas de cada estudiante se realiza mediante la función zip(), la cual evalúa simultáneamente la respuesta dada con la correcta en un bucle optimizado.</w:t>
+      </w:r>
+    </w:p>
+    <w:p>
+      <w:pPr>
+        <w:pStyle w:val="Prrafodelista"/>
+        <w:numPr>
+          <w:ilvl w:val="0"/>
+          <w:numId w:val="10"/>
+        </w:numPr>
+        <w:jc w:val="both"/>
+      </w:pPr>
+      <w:r>
+        <w:t>Los datos e indicadores globales se almacenan dinámicamente en diccionarios para facilitar los cálculos de promedios y la búsqueda del puntaje máximo en una sola pasada.</w:t>
+      </w:r>
+    </w:p>
+    <w:p>
+      <w:pPr>
+        <w:jc w:val="both"/>
+      </w:pPr>
     </w:p>
     <w:p>
       <w:pPr>
@@ -577,6 +712,7 @@
         <w:jc w:val="both"/>
       </w:pPr>
       <w:r>
+        <w:lastRenderedPageBreak/>
         <w:t>Elaborar un algoritmo que actualice la tabla de clasificación del Campeonato</w:t>
       </w:r>
       <w:r>
@@ -1451,6 +1587,119 @@
     </w:lvl>
   </w:abstractNum>
   <w:abstractNum w:abstractNumId="6" w15:restartNumberingAfterBreak="0">
+    <w:nsid w:val="2FBA1F10"/>
+    <w:multiLevelType w:val="hybridMultilevel"/>
+    <w:tmpl w:val="D7881248"/>
+    <w:lvl w:ilvl="0" w:tplc="240A0001">
+      <w:start w:val="1"/>
+      <w:numFmt w:val="bullet"/>
+      <w:lvlText w:val=""/>
+      <w:lvlJc w:val="left"/>
+      <w:pPr>
+        <w:ind w:left="720" w:hanging="360"/>
+      </w:pPr>
+      <w:rPr>
+        <w:rFonts w:ascii="Symbol" w:hAnsi="Symbol" w:hint="default"/>
+      </w:rPr>
+    </w:lvl>
+    <w:lvl w:ilvl="1" w:tplc="240A0003" w:tentative="1">
+      <w:start w:val="1"/>
+      <w:numFmt w:val="bullet"/>
+      <w:lvlText w:val="o"/>
+      <w:lvlJc w:val="left"/>
+      <w:pPr>
+        <w:ind w:left="1440" w:hanging="360"/>
+      </w:pPr>
+      <w:rPr>
+        <w:rFonts w:ascii="Courier New" w:hAnsi="Courier New" w:cs="Courier New" w:hint="default"/>
+      </w:rPr>
+    </w:lvl>
+    <w:lvl w:ilvl="2" w:tplc="240A0005" w:tentative="1">
+      <w:start w:val="1"/>
+      <w:numFmt w:val="bullet"/>
+      <w:lvlText w:val=""/>
+      <w:lvlJc w:val="left"/>
+      <w:pPr>
+        <w:ind w:left="2160" w:hanging="360"/>
+      </w:pPr>
+      <w:rPr>
+        <w:rFonts w:ascii="Wingdings" w:hAnsi="Wingdings" w:hint="default"/>
+      </w:rPr>
+    </w:lvl>
+    <w:lvl w:ilvl="3" w:tplc="240A0001" w:tentative="1">
+      <w:start w:val="1"/>
+      <w:numFmt w:val="bullet"/>
+      <w:lvlText w:val=""/>
+      <w:lvlJc w:val="left"/>
+      <w:pPr>
+        <w:ind w:left="2880" w:hanging="360"/>
+      </w:pPr>
+      <w:rPr>
+        <w:rFonts w:ascii="Symbol" w:hAnsi="Symbol" w:hint="default"/>
+      </w:rPr>
+    </w:lvl>
+    <w:lvl w:ilvl="4" w:tplc="240A0003" w:tentative="1">
+      <w:start w:val="1"/>
+      <w:numFmt w:val="bullet"/>
+      <w:lvlText w:val="o"/>
+      <w:lvlJc w:val="left"/>
+      <w:pPr>
+        <w:ind w:left="3600" w:hanging="360"/>
+      </w:pPr>
+      <w:rPr>
+        <w:rFonts w:ascii="Courier New" w:hAnsi="Courier New" w:cs="Courier New" w:hint="default"/>
+      </w:rPr>
+    </w:lvl>
+    <w:lvl w:ilvl="5" w:tplc="240A0005" w:tentative="1">
+      <w:start w:val="1"/>
+      <w:numFmt w:val="bullet"/>
+      <w:lvlText w:val=""/>
+      <w:lvlJc w:val="left"/>
+      <w:pPr>
+        <w:ind w:left="4320" w:hanging="360"/>
+      </w:pPr>
+      <w:rPr>
+        <w:rFonts w:ascii="Wingdings" w:hAnsi="Wingdings" w:hint="default"/>
+      </w:rPr>
+    </w:lvl>
+    <w:lvl w:ilvl="6" w:tplc="240A0001" w:tentative="1">
+      <w:start w:val="1"/>
+      <w:numFmt w:val="bullet"/>
+      <w:lvlText w:val=""/>
+      <w:lvlJc w:val="left"/>
+      <w:pPr>
+        <w:ind w:left="5040" w:hanging="360"/>
+      </w:pPr>
+      <w:rPr>
+        <w:rFonts w:ascii="Symbol" w:hAnsi="Symbol" w:hint="default"/>
+      </w:rPr>
+    </w:lvl>
+    <w:lvl w:ilvl="7" w:tplc="240A0003" w:tentative="1">
+      <w:start w:val="1"/>
+      <w:numFmt w:val="bullet"/>
+      <w:lvlText w:val="o"/>
+      <w:lvlJc w:val="left"/>
+      <w:pPr>
+        <w:ind w:left="5760" w:hanging="360"/>
+      </w:pPr>
+      <w:rPr>
+        <w:rFonts w:ascii="Courier New" w:hAnsi="Courier New" w:cs="Courier New" w:hint="default"/>
+      </w:rPr>
+    </w:lvl>
+    <w:lvl w:ilvl="8" w:tplc="240A0005" w:tentative="1">
+      <w:start w:val="1"/>
+      <w:numFmt w:val="bullet"/>
+      <w:lvlText w:val=""/>
+      <w:lvlJc w:val="left"/>
+      <w:pPr>
+        <w:ind w:left="6480" w:hanging="360"/>
+      </w:pPr>
+      <w:rPr>
+        <w:rFonts w:ascii="Wingdings" w:hAnsi="Wingdings" w:hint="default"/>
+      </w:rPr>
+    </w:lvl>
+  </w:abstractNum>
+  <w:abstractNum w:abstractNumId="7" w15:restartNumberingAfterBreak="0">
     <w:nsid w:val="44E71ED9"/>
     <w:multiLevelType w:val="hybridMultilevel"/>
     <w:tmpl w:val="52062382"/>
@@ -1536,7 +1785,7 @@
       </w:pPr>
     </w:lvl>
   </w:abstractNum>
-  <w:abstractNum w:abstractNumId="7" w15:restartNumberingAfterBreak="0">
+  <w:abstractNum w:abstractNumId="8" w15:restartNumberingAfterBreak="0">
     <w:nsid w:val="4A96139C"/>
     <w:multiLevelType w:val="hybridMultilevel"/>
     <w:tmpl w:val="05689E9E"/>
@@ -1649,7 +1898,7 @@
       </w:rPr>
     </w:lvl>
   </w:abstractNum>
-  <w:abstractNum w:abstractNumId="8" w15:restartNumberingAfterBreak="0">
+  <w:abstractNum w:abstractNumId="9" w15:restartNumberingAfterBreak="0">
     <w:nsid w:val="6A50485C"/>
     <w:multiLevelType w:val="hybridMultilevel"/>
     <w:tmpl w:val="8962F952"/>
@@ -1772,10 +2021,10 @@
     <w:abstractNumId w:val="3"/>
   </w:num>
   <w:num w:numId="4" w16cid:durableId="864058074">
-    <w:abstractNumId w:val="6"/>
+    <w:abstractNumId w:val="7"/>
   </w:num>
   <w:num w:numId="5" w16cid:durableId="1992053943">
-    <w:abstractNumId w:val="7"/>
+    <w:abstractNumId w:val="8"/>
   </w:num>
   <w:num w:numId="6" w16cid:durableId="793671061">
     <w:abstractNumId w:val="1"/>
@@ -1784,10 +2033,13 @@
     <w:abstractNumId w:val="5"/>
   </w:num>
   <w:num w:numId="8" w16cid:durableId="1203787624">
-    <w:abstractNumId w:val="8"/>
+    <w:abstractNumId w:val="9"/>
   </w:num>
   <w:num w:numId="9" w16cid:durableId="1676956197">
     <w:abstractNumId w:val="2"/>
+  </w:num>
+  <w:num w:numId="10" w16cid:durableId="1053388344">
+    <w:abstractNumId w:val="6"/>
   </w:num>
 </w:numbering>
 </file>

</xml_diff>

<commit_message>
Develop of exercise4 and exercise 4_test, adding the information in word document
</commit_message>
<xml_diff>
--- a/Actividad 7 TALLER/Actividad 7. Taller - Vectores y matrices (2).docx
+++ b/Actividad 7 TALLER/Actividad 7. Taller - Vectores y matrices (2).docx
@@ -699,6 +699,131 @@
     </w:p>
     <w:p>
       <w:pPr>
+        <w:pStyle w:val="Prrafodelista"/>
+        <w:ind w:left="1080"/>
+        <w:jc w:val="both"/>
+      </w:pPr>
+    </w:p>
+    <w:p>
+      <w:pPr>
+        <w:pStyle w:val="Prrafodelista"/>
+        <w:numPr>
+          <w:ilvl w:val="0"/>
+          <w:numId w:val="11"/>
+        </w:numPr>
+        <w:rPr>
+          <w:rFonts w:ascii="Times New Roman" w:eastAsia="Times New Roman" w:hAnsi="Times New Roman" w:cs="Times New Roman"/>
+          <w:lang w:val="es-CO" w:eastAsia="es-CO"/>
+        </w:rPr>
+      </w:pPr>
+      <w:r>
+        <w:rPr>
+          <w:rFonts w:ascii="Times New Roman" w:eastAsia="Times New Roman" w:hAnsi="Times New Roman" w:cs="Times New Roman"/>
+          <w:lang w:val="es-CO" w:eastAsia="es-CO"/>
+        </w:rPr>
+        <w:t xml:space="preserve">El problema requiere procesar una matriz bidimensional de tamaño </w:t>
+      </w:r>
+    </w:p>
+    <w:p>
+      <w:pPr>
+        <w:pStyle w:val="Prrafodelista"/>
+        <w:ind w:left="1800"/>
+        <w:rPr>
+          <w:rFonts w:ascii="Times New Roman" w:eastAsia="Times New Roman" w:hAnsi="Times New Roman" w:cs="Times New Roman"/>
+          <w:lang w:val="es-CO" w:eastAsia="es-CO"/>
+        </w:rPr>
+      </w:pPr>
+      <w:proofErr w:type="gramStart"/>
+      <w:r>
+        <w:rPr>
+          <w:rFonts w:ascii="Arial" w:eastAsia="Times New Roman" w:hAnsi="Arial" w:cs="Arial"/>
+          <w:lang w:val="es-CO" w:eastAsia="es-CO"/>
+        </w:rPr>
+        <w:lastRenderedPageBreak/>
+        <w:t xml:space="preserve">N  </w:t>
+      </w:r>
+      <w:r>
+        <w:rPr>
+          <w:rFonts w:ascii="Arial" w:eastAsia="Times New Roman" w:hAnsi="Arial" w:cs="Arial"/>
+          <w:lang w:val="es-CO" w:eastAsia="es-CO"/>
+        </w:rPr>
+        <w:t>x</w:t>
+      </w:r>
+      <w:proofErr w:type="gramEnd"/>
+      <w:r>
+        <w:rPr>
+          <w:rFonts w:ascii="Arial" w:eastAsia="Times New Roman" w:hAnsi="Arial" w:cs="Arial"/>
+          <w:lang w:val="es-CO" w:eastAsia="es-CO"/>
+        </w:rPr>
+        <w:t xml:space="preserve"> </w:t>
+      </w:r>
+      <w:r>
+        <w:rPr>
+          <w:rFonts w:ascii="Arial" w:eastAsia="Times New Roman" w:hAnsi="Arial" w:cs="Arial"/>
+          <w:lang w:val="es-CO" w:eastAsia="es-CO"/>
+        </w:rPr>
+        <w:t>M</w:t>
+      </w:r>
+      <w:r>
+        <w:rPr>
+          <w:rFonts w:ascii="Times New Roman" w:eastAsia="Times New Roman" w:hAnsi="Times New Roman" w:cs="Times New Roman"/>
+          <w:lang w:val="es-CO" w:eastAsia="es-CO"/>
+        </w:rPr>
+        <w:t>, donde cada fila representa a un vendedor y cada columna un año de operación.</w:t>
+      </w:r>
+    </w:p>
+    <w:p>
+      <w:pPr>
+        <w:pStyle w:val="Prrafodelista"/>
+        <w:numPr>
+          <w:ilvl w:val="0"/>
+          <w:numId w:val="11"/>
+        </w:numPr>
+        <w:jc w:val="both"/>
+      </w:pPr>
+      <w:r>
+        <w:t>Se modularizó la solución en una función principal que recibe la matriz de datos numéricos.</w:t>
+      </w:r>
+    </w:p>
+    <w:p>
+      <w:pPr>
+        <w:pStyle w:val="Prrafodelista"/>
+        <w:numPr>
+          <w:ilvl w:val="0"/>
+          <w:numId w:val="11"/>
+        </w:numPr>
+        <w:jc w:val="both"/>
+      </w:pPr>
+      <w:r>
+        <w:t>Total,</w:t>
+      </w:r>
+      <w:r>
+        <w:t xml:space="preserve"> por Año: Se calcula recorriendo la matriz por columnas. Se inicializa un arreglo de ceros de tamaño M y se anidan dos bucles (</w:t>
+      </w:r>
+      <w:proofErr w:type="spellStart"/>
+      <w:r>
+        <w:t>for</w:t>
+      </w:r>
+      <w:proofErr w:type="spellEnd"/>
+      <w:r>
+        <w:t>) para ir acumulando verticalmente los valores de cada año.</w:t>
+      </w:r>
+    </w:p>
+    <w:p>
+      <w:pPr>
+        <w:pStyle w:val="Prrafodelista"/>
+        <w:numPr>
+          <w:ilvl w:val="0"/>
+          <w:numId w:val="11"/>
+        </w:numPr>
+        <w:jc w:val="both"/>
+      </w:pPr>
+      <w:r>
+        <w:t>Gran Total: Es una reducción final que suma todos los totales de los vendedores para obtener la cifra global de la empresa.</w:t>
+      </w:r>
+    </w:p>
+    <w:p>
+      <w:pPr>
         <w:jc w:val="both"/>
       </w:pPr>
     </w:p>
@@ -712,7 +837,6 @@
         <w:jc w:val="both"/>
       </w:pPr>
       <w:r>
-        <w:lastRenderedPageBreak/>
         <w:t>Elaborar un algoritmo que actualice la tabla de clasificación del Campeonato</w:t>
       </w:r>
       <w:r>
@@ -2005,6 +2129,119 @@
       <w:lvlJc w:val="left"/>
       <w:pPr>
         <w:ind w:left="6480" w:hanging="360"/>
+      </w:pPr>
+      <w:rPr>
+        <w:rFonts w:ascii="Wingdings" w:hAnsi="Wingdings" w:hint="default"/>
+      </w:rPr>
+    </w:lvl>
+  </w:abstractNum>
+  <w:abstractNum w:abstractNumId="10" w15:restartNumberingAfterBreak="0">
+    <w:nsid w:val="6C362E36"/>
+    <w:multiLevelType w:val="hybridMultilevel"/>
+    <w:tmpl w:val="034CC1D8"/>
+    <w:lvl w:ilvl="0" w:tplc="240A0003">
+      <w:start w:val="1"/>
+      <w:numFmt w:val="bullet"/>
+      <w:lvlText w:val="o"/>
+      <w:lvlJc w:val="left"/>
+      <w:pPr>
+        <w:ind w:left="1800" w:hanging="360"/>
+      </w:pPr>
+      <w:rPr>
+        <w:rFonts w:ascii="Courier New" w:hAnsi="Courier New" w:cs="Courier New" w:hint="default"/>
+      </w:rPr>
+    </w:lvl>
+    <w:lvl w:ilvl="1" w:tplc="240A0003" w:tentative="1">
+      <w:start w:val="1"/>
+      <w:numFmt w:val="bullet"/>
+      <w:lvlText w:val="o"/>
+      <w:lvlJc w:val="left"/>
+      <w:pPr>
+        <w:ind w:left="2520" w:hanging="360"/>
+      </w:pPr>
+      <w:rPr>
+        <w:rFonts w:ascii="Courier New" w:hAnsi="Courier New" w:cs="Courier New" w:hint="default"/>
+      </w:rPr>
+    </w:lvl>
+    <w:lvl w:ilvl="2" w:tplc="240A0005" w:tentative="1">
+      <w:start w:val="1"/>
+      <w:numFmt w:val="bullet"/>
+      <w:lvlText w:val=""/>
+      <w:lvlJc w:val="left"/>
+      <w:pPr>
+        <w:ind w:left="3240" w:hanging="360"/>
+      </w:pPr>
+      <w:rPr>
+        <w:rFonts w:ascii="Wingdings" w:hAnsi="Wingdings" w:hint="default"/>
+      </w:rPr>
+    </w:lvl>
+    <w:lvl w:ilvl="3" w:tplc="240A0001" w:tentative="1">
+      <w:start w:val="1"/>
+      <w:numFmt w:val="bullet"/>
+      <w:lvlText w:val=""/>
+      <w:lvlJc w:val="left"/>
+      <w:pPr>
+        <w:ind w:left="3960" w:hanging="360"/>
+      </w:pPr>
+      <w:rPr>
+        <w:rFonts w:ascii="Symbol" w:hAnsi="Symbol" w:hint="default"/>
+      </w:rPr>
+    </w:lvl>
+    <w:lvl w:ilvl="4" w:tplc="240A0003" w:tentative="1">
+      <w:start w:val="1"/>
+      <w:numFmt w:val="bullet"/>
+      <w:lvlText w:val="o"/>
+      <w:lvlJc w:val="left"/>
+      <w:pPr>
+        <w:ind w:left="4680" w:hanging="360"/>
+      </w:pPr>
+      <w:rPr>
+        <w:rFonts w:ascii="Courier New" w:hAnsi="Courier New" w:cs="Courier New" w:hint="default"/>
+      </w:rPr>
+    </w:lvl>
+    <w:lvl w:ilvl="5" w:tplc="240A0005" w:tentative="1">
+      <w:start w:val="1"/>
+      <w:numFmt w:val="bullet"/>
+      <w:lvlText w:val=""/>
+      <w:lvlJc w:val="left"/>
+      <w:pPr>
+        <w:ind w:left="5400" w:hanging="360"/>
+      </w:pPr>
+      <w:rPr>
+        <w:rFonts w:ascii="Wingdings" w:hAnsi="Wingdings" w:hint="default"/>
+      </w:rPr>
+    </w:lvl>
+    <w:lvl w:ilvl="6" w:tplc="240A0001" w:tentative="1">
+      <w:start w:val="1"/>
+      <w:numFmt w:val="bullet"/>
+      <w:lvlText w:val=""/>
+      <w:lvlJc w:val="left"/>
+      <w:pPr>
+        <w:ind w:left="6120" w:hanging="360"/>
+      </w:pPr>
+      <w:rPr>
+        <w:rFonts w:ascii="Symbol" w:hAnsi="Symbol" w:hint="default"/>
+      </w:rPr>
+    </w:lvl>
+    <w:lvl w:ilvl="7" w:tplc="240A0003" w:tentative="1">
+      <w:start w:val="1"/>
+      <w:numFmt w:val="bullet"/>
+      <w:lvlText w:val="o"/>
+      <w:lvlJc w:val="left"/>
+      <w:pPr>
+        <w:ind w:left="6840" w:hanging="360"/>
+      </w:pPr>
+      <w:rPr>
+        <w:rFonts w:ascii="Courier New" w:hAnsi="Courier New" w:cs="Courier New" w:hint="default"/>
+      </w:rPr>
+    </w:lvl>
+    <w:lvl w:ilvl="8" w:tplc="240A0005" w:tentative="1">
+      <w:start w:val="1"/>
+      <w:numFmt w:val="bullet"/>
+      <w:lvlText w:val=""/>
+      <w:lvlJc w:val="left"/>
+      <w:pPr>
+        <w:ind w:left="7560" w:hanging="360"/>
       </w:pPr>
       <w:rPr>
         <w:rFonts w:ascii="Wingdings" w:hAnsi="Wingdings" w:hint="default"/>
@@ -2040,6 +2277,9 @@
   </w:num>
   <w:num w:numId="10" w16cid:durableId="1053388344">
     <w:abstractNumId w:val="6"/>
+  </w:num>
+  <w:num w:numId="11" w16cid:durableId="928270856">
+    <w:abstractNumId w:val="10"/>
   </w:num>
 </w:numbering>
 </file>
@@ -2797,12 +3037,9 @@
 </file>
 
 <file path=customXml/item1.xml><?xml version="1.0" encoding="utf-8"?>
-<?mso-contentType ?>
-<FormTemplates xmlns="http://schemas.microsoft.com/sharepoint/v3/contenttype/forms">
-  <Display>DocumentLibraryForm</Display>
-  <Edit>DocumentLibraryForm</Edit>
-  <New>DocumentLibraryForm</New>
-</FormTemplates>
+<p:properties xmlns:p="http://schemas.microsoft.com/office/2006/metadata/properties" xmlns:xsi="http://www.w3.org/2001/XMLSchema-instance" xmlns:pc="http://schemas.microsoft.com/office/infopath/2007/PartnerControls">
+  <documentManagement/>
+</p:properties>
 </file>
 
 <file path=customXml/item2.xml><?xml version="1.0" encoding="utf-8"?>
@@ -3029,15 +3266,19 @@
 </file>
 
 <file path=customXml/item3.xml><?xml version="1.0" encoding="utf-8"?>
-<p:properties xmlns:p="http://schemas.microsoft.com/office/2006/metadata/properties" xmlns:xsi="http://www.w3.org/2001/XMLSchema-instance" xmlns:pc="http://schemas.microsoft.com/office/infopath/2007/PartnerControls">
-  <documentManagement/>
-</p:properties>
+<?mso-contentType ?>
+<FormTemplates xmlns="http://schemas.microsoft.com/sharepoint/v3/contenttype/forms">
+  <Display>DocumentLibraryForm</Display>
+  <Edit>DocumentLibraryForm</Edit>
+  <New>DocumentLibraryForm</New>
+</FormTemplates>
 </file>
 
 <file path=customXml/itemProps1.xml><?xml version="1.0" encoding="utf-8"?>
-<ds:datastoreItem xmlns:ds="http://schemas.openxmlformats.org/officeDocument/2006/customXml" ds:itemID="{EB3AAEAC-9C2B-48ED-BE3E-CBD25FA9BE19}">
+<ds:datastoreItem xmlns:ds="http://schemas.openxmlformats.org/officeDocument/2006/customXml" ds:itemID="{50577FB4-07F9-42E8-B13F-2A64AD365220}">
   <ds:schemaRefs>
-    <ds:schemaRef ds:uri="http://schemas.microsoft.com/sharepoint/v3/contenttype/forms"/>
+    <ds:schemaRef ds:uri="http://schemas.microsoft.com/office/2006/metadata/properties"/>
+    <ds:schemaRef ds:uri="http://schemas.microsoft.com/office/infopath/2007/PartnerControls"/>
   </ds:schemaRefs>
 </ds:datastoreItem>
 </file>
@@ -3062,10 +3303,9 @@
 </file>
 
 <file path=customXml/itemProps3.xml><?xml version="1.0" encoding="utf-8"?>
-<ds:datastoreItem xmlns:ds="http://schemas.openxmlformats.org/officeDocument/2006/customXml" ds:itemID="{50577FB4-07F9-42E8-B13F-2A64AD365220}">
+<ds:datastoreItem xmlns:ds="http://schemas.openxmlformats.org/officeDocument/2006/customXml" ds:itemID="{EB3AAEAC-9C2B-48ED-BE3E-CBD25FA9BE19}">
   <ds:schemaRefs>
-    <ds:schemaRef ds:uri="http://schemas.microsoft.com/office/2006/metadata/properties"/>
-    <ds:schemaRef ds:uri="http://schemas.microsoft.com/office/infopath/2007/PartnerControls"/>
+    <ds:schemaRef ds:uri="http://schemas.microsoft.com/sharepoint/v3/contenttype/forms"/>
   </ds:schemaRefs>
 </ds:datastoreItem>
 </file>
</xml_diff>

<commit_message>
Develop of Exercise5 and Exercise5_tets (as edge case) and information left in word document
</commit_message>
<xml_diff>
--- a/Actividad 7 TALLER/Actividad 7. Taller - Vectores y matrices (2).docx
+++ b/Actividad 7 TALLER/Actividad 7. Taller - Vectores y matrices (2).docx
@@ -1040,7 +1040,103 @@
         <w:jc w:val="both"/>
       </w:pPr>
       <w:r>
-        <w:t>El algoritmo debe mostrar la tabla leída, ordenada de acuerdo a la puntuación, luego de haber calculado los puntos para cada equipo.</w:t>
+        <w:t xml:space="preserve">El algoritmo debe mostrar la tabla leída, ordenada </w:t>
+      </w:r>
+      <w:proofErr w:type="gramStart"/>
+      <w:r>
+        <w:t>de acuerdo a</w:t>
+      </w:r>
+      <w:proofErr w:type="gramEnd"/>
+      <w:r>
+        <w:t xml:space="preserve"> la puntuación, luego de haber calculado los puntos para cada equipo.</w:t>
+      </w:r>
+    </w:p>
+    <w:p>
+      <w:pPr>
+        <w:ind w:left="360"/>
+        <w:jc w:val="both"/>
+      </w:pPr>
+    </w:p>
+    <w:p>
+      <w:pPr>
+        <w:pStyle w:val="Prrafodelista"/>
+        <w:numPr>
+          <w:ilvl w:val="0"/>
+          <w:numId w:val="12"/>
+        </w:numPr>
+        <w:jc w:val="both"/>
+      </w:pPr>
+      <w:r>
+        <w:t>El problema requiere procesar la tabla de posiciones actual de una liga de fútbol y actualizarla con los resultados de los partidos jugados en la última fecha.</w:t>
+      </w:r>
+    </w:p>
+    <w:p>
+      <w:pPr>
+        <w:pStyle w:val="Prrafodelista"/>
+        <w:numPr>
+          <w:ilvl w:val="0"/>
+          <w:numId w:val="12"/>
+        </w:numPr>
+        <w:jc w:val="both"/>
+      </w:pPr>
+      <w:r>
+        <w:t xml:space="preserve">Los equipos se almacenan en un diccionario donde la clave es el </w:t>
+      </w:r>
+      <w:r>
+        <w:t>código</w:t>
+      </w:r>
+      <w:r>
+        <w:t xml:space="preserve"> del equipo para permitir búsquedas directas de O(1) al procesar los goles. Los partidos se manejan como una lista de diccionarios.</w:t>
+      </w:r>
+    </w:p>
+    <w:p>
+      <w:pPr>
+        <w:pStyle w:val="Prrafodelista"/>
+        <w:numPr>
+          <w:ilvl w:val="0"/>
+          <w:numId w:val="12"/>
+        </w:numPr>
+        <w:jc w:val="both"/>
+      </w:pPr>
+      <w:r>
+        <w:t xml:space="preserve">El algoritmo recorre los partidos de la fecha. Para cada encuentro, incrementa los partidos jugados </w:t>
+      </w:r>
+      <w:proofErr w:type="spellStart"/>
+      <w:r>
+        <w:t>pj</w:t>
+      </w:r>
+      <w:proofErr w:type="spellEnd"/>
+      <w:r>
+        <w:t xml:space="preserve">, suma los goles a favor </w:t>
+      </w:r>
+      <w:proofErr w:type="spellStart"/>
+      <w:r>
+        <w:t>gf</w:t>
+      </w:r>
+      <w:proofErr w:type="spellEnd"/>
+      <w:r>
+        <w:t xml:space="preserve"> y en contra </w:t>
+      </w:r>
+      <w:proofErr w:type="spellStart"/>
+      <w:r>
+        <w:t>gc</w:t>
+      </w:r>
+      <w:proofErr w:type="spellEnd"/>
+      <w:r>
+        <w:t xml:space="preserve"> de cada bando, y distribuye los puntos estadísticos basándose en el marcador: +3 puntos al ganador, o +1 punto a cada uno en caso de empate.</w:t>
+      </w:r>
+    </w:p>
+    <w:p>
+      <w:pPr>
+        <w:pStyle w:val="Prrafodelista"/>
+        <w:numPr>
+          <w:ilvl w:val="0"/>
+          <w:numId w:val="12"/>
+        </w:numPr>
+        <w:jc w:val="both"/>
+      </w:pPr>
+      <w:r>
+        <w:t>Para mostrar la tabla final de forma descendente, se utiliza el método de la Burbuja. La condición tradicional de intercambio se modificó para priorizar los Puntos. En caso de que dos equipos tengan los mismos puntos, se aplica un criterio de desempate por Diferencia de Goles (GF - GC).</w:t>
       </w:r>
     </w:p>
     <w:p/>
@@ -1599,6 +1695,119 @@
     </w:lvl>
   </w:abstractNum>
   <w:abstractNum w:abstractNumId="5" w15:restartNumberingAfterBreak="0">
+    <w:nsid w:val="2E162E04"/>
+    <w:multiLevelType w:val="hybridMultilevel"/>
+    <w:tmpl w:val="23967C58"/>
+    <w:lvl w:ilvl="0" w:tplc="240A0003">
+      <w:start w:val="1"/>
+      <w:numFmt w:val="bullet"/>
+      <w:lvlText w:val="o"/>
+      <w:lvlJc w:val="left"/>
+      <w:pPr>
+        <w:ind w:left="1080" w:hanging="360"/>
+      </w:pPr>
+      <w:rPr>
+        <w:rFonts w:ascii="Courier New" w:hAnsi="Courier New" w:cs="Courier New" w:hint="default"/>
+      </w:rPr>
+    </w:lvl>
+    <w:lvl w:ilvl="1" w:tplc="240A0003" w:tentative="1">
+      <w:start w:val="1"/>
+      <w:numFmt w:val="bullet"/>
+      <w:lvlText w:val="o"/>
+      <w:lvlJc w:val="left"/>
+      <w:pPr>
+        <w:ind w:left="1800" w:hanging="360"/>
+      </w:pPr>
+      <w:rPr>
+        <w:rFonts w:ascii="Courier New" w:hAnsi="Courier New" w:cs="Courier New" w:hint="default"/>
+      </w:rPr>
+    </w:lvl>
+    <w:lvl w:ilvl="2" w:tplc="240A0005" w:tentative="1">
+      <w:start w:val="1"/>
+      <w:numFmt w:val="bullet"/>
+      <w:lvlText w:val=""/>
+      <w:lvlJc w:val="left"/>
+      <w:pPr>
+        <w:ind w:left="2520" w:hanging="360"/>
+      </w:pPr>
+      <w:rPr>
+        <w:rFonts w:ascii="Wingdings" w:hAnsi="Wingdings" w:hint="default"/>
+      </w:rPr>
+    </w:lvl>
+    <w:lvl w:ilvl="3" w:tplc="240A0001" w:tentative="1">
+      <w:start w:val="1"/>
+      <w:numFmt w:val="bullet"/>
+      <w:lvlText w:val=""/>
+      <w:lvlJc w:val="left"/>
+      <w:pPr>
+        <w:ind w:left="3240" w:hanging="360"/>
+      </w:pPr>
+      <w:rPr>
+        <w:rFonts w:ascii="Symbol" w:hAnsi="Symbol" w:hint="default"/>
+      </w:rPr>
+    </w:lvl>
+    <w:lvl w:ilvl="4" w:tplc="240A0003" w:tentative="1">
+      <w:start w:val="1"/>
+      <w:numFmt w:val="bullet"/>
+      <w:lvlText w:val="o"/>
+      <w:lvlJc w:val="left"/>
+      <w:pPr>
+        <w:ind w:left="3960" w:hanging="360"/>
+      </w:pPr>
+      <w:rPr>
+        <w:rFonts w:ascii="Courier New" w:hAnsi="Courier New" w:cs="Courier New" w:hint="default"/>
+      </w:rPr>
+    </w:lvl>
+    <w:lvl w:ilvl="5" w:tplc="240A0005" w:tentative="1">
+      <w:start w:val="1"/>
+      <w:numFmt w:val="bullet"/>
+      <w:lvlText w:val=""/>
+      <w:lvlJc w:val="left"/>
+      <w:pPr>
+        <w:ind w:left="4680" w:hanging="360"/>
+      </w:pPr>
+      <w:rPr>
+        <w:rFonts w:ascii="Wingdings" w:hAnsi="Wingdings" w:hint="default"/>
+      </w:rPr>
+    </w:lvl>
+    <w:lvl w:ilvl="6" w:tplc="240A0001" w:tentative="1">
+      <w:start w:val="1"/>
+      <w:numFmt w:val="bullet"/>
+      <w:lvlText w:val=""/>
+      <w:lvlJc w:val="left"/>
+      <w:pPr>
+        <w:ind w:left="5400" w:hanging="360"/>
+      </w:pPr>
+      <w:rPr>
+        <w:rFonts w:ascii="Symbol" w:hAnsi="Symbol" w:hint="default"/>
+      </w:rPr>
+    </w:lvl>
+    <w:lvl w:ilvl="7" w:tplc="240A0003" w:tentative="1">
+      <w:start w:val="1"/>
+      <w:numFmt w:val="bullet"/>
+      <w:lvlText w:val="o"/>
+      <w:lvlJc w:val="left"/>
+      <w:pPr>
+        <w:ind w:left="6120" w:hanging="360"/>
+      </w:pPr>
+      <w:rPr>
+        <w:rFonts w:ascii="Courier New" w:hAnsi="Courier New" w:cs="Courier New" w:hint="default"/>
+      </w:rPr>
+    </w:lvl>
+    <w:lvl w:ilvl="8" w:tplc="240A0005" w:tentative="1">
+      <w:start w:val="1"/>
+      <w:numFmt w:val="bullet"/>
+      <w:lvlText w:val=""/>
+      <w:lvlJc w:val="left"/>
+      <w:pPr>
+        <w:ind w:left="6840" w:hanging="360"/>
+      </w:pPr>
+      <w:rPr>
+        <w:rFonts w:ascii="Wingdings" w:hAnsi="Wingdings" w:hint="default"/>
+      </w:rPr>
+    </w:lvl>
+  </w:abstractNum>
+  <w:abstractNum w:abstractNumId="6" w15:restartNumberingAfterBreak="0">
     <w:nsid w:val="2E9C59B2"/>
     <w:multiLevelType w:val="hybridMultilevel"/>
     <w:tmpl w:val="9C32A5C4"/>
@@ -1710,7 +1919,7 @@
       </w:rPr>
     </w:lvl>
   </w:abstractNum>
-  <w:abstractNum w:abstractNumId="6" w15:restartNumberingAfterBreak="0">
+  <w:abstractNum w:abstractNumId="7" w15:restartNumberingAfterBreak="0">
     <w:nsid w:val="2FBA1F10"/>
     <w:multiLevelType w:val="hybridMultilevel"/>
     <w:tmpl w:val="D7881248"/>
@@ -1823,7 +2032,7 @@
       </w:rPr>
     </w:lvl>
   </w:abstractNum>
-  <w:abstractNum w:abstractNumId="7" w15:restartNumberingAfterBreak="0">
+  <w:abstractNum w:abstractNumId="8" w15:restartNumberingAfterBreak="0">
     <w:nsid w:val="44E71ED9"/>
     <w:multiLevelType w:val="hybridMultilevel"/>
     <w:tmpl w:val="52062382"/>
@@ -1909,7 +2118,7 @@
       </w:pPr>
     </w:lvl>
   </w:abstractNum>
-  <w:abstractNum w:abstractNumId="8" w15:restartNumberingAfterBreak="0">
+  <w:abstractNum w:abstractNumId="9" w15:restartNumberingAfterBreak="0">
     <w:nsid w:val="4A96139C"/>
     <w:multiLevelType w:val="hybridMultilevel"/>
     <w:tmpl w:val="05689E9E"/>
@@ -2022,7 +2231,7 @@
       </w:rPr>
     </w:lvl>
   </w:abstractNum>
-  <w:abstractNum w:abstractNumId="9" w15:restartNumberingAfterBreak="0">
+  <w:abstractNum w:abstractNumId="10" w15:restartNumberingAfterBreak="0">
     <w:nsid w:val="6A50485C"/>
     <w:multiLevelType w:val="hybridMultilevel"/>
     <w:tmpl w:val="8962F952"/>
@@ -2135,7 +2344,7 @@
       </w:rPr>
     </w:lvl>
   </w:abstractNum>
-  <w:abstractNum w:abstractNumId="10" w15:restartNumberingAfterBreak="0">
+  <w:abstractNum w:abstractNumId="11" w15:restartNumberingAfterBreak="0">
     <w:nsid w:val="6C362E36"/>
     <w:multiLevelType w:val="hybridMultilevel"/>
     <w:tmpl w:val="034CC1D8"/>
@@ -2258,28 +2467,31 @@
     <w:abstractNumId w:val="3"/>
   </w:num>
   <w:num w:numId="4" w16cid:durableId="864058074">
-    <w:abstractNumId w:val="7"/>
+    <w:abstractNumId w:val="8"/>
   </w:num>
   <w:num w:numId="5" w16cid:durableId="1992053943">
-    <w:abstractNumId w:val="8"/>
+    <w:abstractNumId w:val="9"/>
   </w:num>
   <w:num w:numId="6" w16cid:durableId="793671061">
     <w:abstractNumId w:val="1"/>
   </w:num>
   <w:num w:numId="7" w16cid:durableId="433593866">
-    <w:abstractNumId w:val="5"/>
+    <w:abstractNumId w:val="6"/>
   </w:num>
   <w:num w:numId="8" w16cid:durableId="1203787624">
-    <w:abstractNumId w:val="9"/>
+    <w:abstractNumId w:val="10"/>
   </w:num>
   <w:num w:numId="9" w16cid:durableId="1676956197">
     <w:abstractNumId w:val="2"/>
   </w:num>
   <w:num w:numId="10" w16cid:durableId="1053388344">
-    <w:abstractNumId w:val="6"/>
+    <w:abstractNumId w:val="7"/>
   </w:num>
   <w:num w:numId="11" w16cid:durableId="928270856">
-    <w:abstractNumId w:val="10"/>
+    <w:abstractNumId w:val="11"/>
+  </w:num>
+  <w:num w:numId="12" w16cid:durableId="1938252637">
+    <w:abstractNumId w:val="5"/>
   </w:num>
 </w:numbering>
 </file>

</xml_diff>